<commit_message>
fix: clarify FormulaFlow and correct processing, review and export failures
</commit_message>
<xml_diff>
--- a/docs/verification/sample-output.docx
+++ b/docs/verification/sample-output.docx
@@ -16,9 +16,6 @@
       </w:r>
     </w:p>
     <w:p>
-      <w:pPr>
-        <w:pStyle w:val="Heading2"/>
-      </w:pPr>
       <w:r>
         <w:t xml:space="preserve">例：计算定积分</w:t>
       </w:r>
@@ -260,7 +257,7 @@
     </w:tbl>
     <w:p>
       <w:r>
-        <w:t xml:space="preserve">FormulaFlow Open 公开演示素材</w:t>
+        <w:t xml:space="preserve">微积分笔记示例</w:t>
       </w:r>
     </w:p>
     <w:sectPr>

</xml_diff>